<commit_message>
Fix report consistency: feature breakdown, timing terminology, framing
- Section 2.3: Cross-expert features now correctly described as
  6 pairwise Jaccard overlaps + 4 unique-to-expert + 1 all-agree (not ECMP overlaps)
- TM stats, per-expert stats, GNN diagnostics match actual code exactly
- Timing: explicit terminology (decision=selector overhead, LP=solver, total=end-to-end)
- Abstract clarifies 48.4ms is decision overhead, 118.8ms is end-to-end

Co-Authored-By: Claude Opus 4.6 <noreply@anthropic.com>
</commit_message>
<xml_diff>
--- a/Definitive_Meta_Evaluation.docx
+++ b/Definitive_Meta_Evaluation.docx
@@ -73,7 +73,7 @@
         <w:t xml:space="preserve">Key results: </w:t>
       </w:r>
       <w:r>
-        <w:t>Germany50 (unseen): GNN selected 64% of timesteps, oracle gap +0.33%, accuracy 65.9%. Overall accuracy 60.3% across 8 topologies. Three topologies achieve +0.00% oracle gap (Abilene, GEANT, Ebone). Mean decision time 48.4 ms.</w:t>
+        <w:t>Germany50 (unseen): GNN selected 64% of timesteps, oracle gap +0.33%, accuracy 65.9%. Overall accuracy 60.3% across 8 topologies. Three topologies achieve +0.00% oracle gap (Abilene, GEANT, Ebone). Mean selector decision overhead 48.4 ms; mean end-to-end time (including LP) 118.8 ms.</w:t>
       </w:r>
     </w:p>
     <w:p>
@@ -354,7 +354,7 @@
                 <w:rFonts w:ascii="Arial" w:hAnsi="Arial"/>
                 <w:sz w:val="20"/>
               </w:rPr>
-              <w:t>mean, std, max, min, skew, kurtosis, sparsity, entropy of the traffic matrix</w:t>
+              <w:t>mean, std, max, min_nonzero, skew, kurtosis, entropy, top-10 demand share</w:t>
             </w:r>
           </w:p>
         </w:tc>
@@ -410,7 +410,7 @@
                 <w:rFonts w:ascii="Arial" w:hAnsi="Arial"/>
                 <w:sz w:val="20"/>
               </w:rPr>
-              <w:t>4 experts x {mean, std, max, sum} of selected OD demands</w:t>
+              <w:t>4 experts x {mean_demand, std_demand, max_demand, coverage} of selected OD pairs</w:t>
             </w:r>
           </w:p>
         </w:tc>
@@ -430,7 +430,7 @@
                 <w:rFonts w:ascii="Arial" w:hAnsi="Arial"/>
                 <w:sz w:val="20"/>
               </w:rPr>
-              <w:t>Cross-expert overlaps (11)</w:t>
+              <w:t>Cross-expert agreement (11)</w:t>
             </w:r>
           </w:p>
         </w:tc>
@@ -466,7 +466,7 @@
                 <w:rFonts w:ascii="Arial" w:hAnsi="Arial"/>
                 <w:sz w:val="20"/>
               </w:rPr>
-              <w:t>pairwise Jaccard overlaps between all 6 expert pairs + 5 expert-vs-ECMP overlaps</w:t>
+              <w:t>6 pairwise Jaccard overlaps (BN-TopK, BN-Sens, BN-GNN, TopK-Sens, TopK-GNN, Sens-GNN) + 4 unique-to-expert fractions + 1 all-four-agree fraction</w:t>
             </w:r>
           </w:p>
         </w:tc>
@@ -578,7 +578,7 @@
                 <w:rFonts w:ascii="Arial" w:hAnsi="Arial"/>
                 <w:sz w:val="20"/>
               </w:rPr>
-              <w:t>GNN confidence, selection entropy, demand concentration, coverage, edge utilization variance</w:t>
+              <w:t>alpha (mixing weight), confidence, GNN correction mean, w_bottleneck, w_sensitivity</w:t>
             </w:r>
           </w:p>
         </w:tc>
@@ -7178,7 +7178,12 @@
     <w:p/>
     <w:p>
       <w:r>
-        <w:t>The MLP gate decision (feature extraction + MLP forward pass) takes &lt; 2 ms on all topologies. LP optimization dominates total time. The 4 expert runs add overhead (all must run before the gate can decide), but this is inherent to the 'run all, pick best' architecture.</w:t>
+        <w:t>Terminology: Decision time = all selector overhead before LP (running 4 experts + feature extraction + MLP forward pass). LP time = LP solver only. Total time = decision time + LP time (full end-to-end per timestep).</w:t>
+      </w:r>
+    </w:p>
+    <w:p>
+      <w:r>
+        <w:t>The MLP gate inference itself (feature extraction + MLP forward pass) takes &lt; 2 ms on all topologies. The decision time is dominated by running all 4 experts (required before the gate can decide). LP optimization adds roughly equal time. Both components are inherent to the 'run all experts, pick best, solve LP' architecture.</w:t>
       </w:r>
     </w:p>
     <w:p>
@@ -7186,7 +7191,7 @@
         <w:rPr>
           <w:b/>
         </w:rPr>
-        <w:t xml:space="preserve">Mean decision time: </w:t>
+        <w:t xml:space="preserve">Mean decision time (selector overhead before LP): </w:t>
       </w:r>
       <w:r>
         <w:t xml:space="preserve">48.4 ms. </w:t>
@@ -7195,7 +7200,7 @@
         <w:rPr>
           <w:b/>
         </w:rPr>
-        <w:t xml:space="preserve">Mean LP time: </w:t>
+        <w:t xml:space="preserve">Mean LP time (solver only): </w:t>
       </w:r>
       <w:r>
         <w:t xml:space="preserve">51.5 ms. </w:t>
@@ -7204,7 +7209,7 @@
         <w:rPr>
           <w:b/>
         </w:rPr>
-        <w:t xml:space="preserve">Mean total time: </w:t>
+        <w:t xml:space="preserve">Mean total time (end-to-end): </w:t>
       </w:r>
       <w:r>
         <w:t>118.8 ms.</w:t>

</xml_diff>